<commit_message>
fix: add .env.example for CI + update .env.example with default values
</commit_message>
<xml_diff>
--- a/docs/GazeConnect_WorkPlan_v4_FINAL.docx
+++ b/docs/GazeConnect_WorkPlan_v4_FINAL.docx
@@ -14799,9 +14799,6 @@
     <w:p>
       <w:pPr>
         <w:spacing w:before="80"/>
-        <w:rPr>
-          <w:rFonts w:hint="cs"/>
-        </w:rPr>
       </w:pPr>
     </w:p>
     <w:p>
@@ -16448,11 +16445,225 @@
     </w:p>
     <w:p>
       <w:pPr>
+        <w:bidi w:val="0"/>
+        <w:spacing w:before="60" w:after="60"/>
+      </w:pPr>
+    </w:p>
+    <w:p>
+      <w:pPr>
+        <w:bidi w:val="0"/>
+        <w:spacing w:before="60" w:after="60"/>
+      </w:pPr>
+    </w:p>
+    <w:p>
+      <w:pPr>
+        <w:bidi w:val="0"/>
+        <w:spacing w:before="60" w:after="60"/>
+        <w:jc w:val="right"/>
+        <w:rPr>
+          <w:rtl/>
+        </w:rPr>
+      </w:pPr>
+      <w:r>
+        <w:rPr>
+          <w:rFonts w:ascii="Segoe UI Emoji" w:hAnsi="Segoe UI Emoji" w:cs="Segoe UI Emoji"/>
+        </w:rPr>
+        <w:t>📝</w:t>
+      </w:r>
+      <w:r>
+        <w:t xml:space="preserve"> </w:t>
+      </w:r>
+      <w:r>
+        <w:rPr>
+          <w:rtl/>
+        </w:rPr>
+        <w:t>עדכון בפועל (שלב 2.4)</w:t>
+      </w:r>
+      <w:r>
+        <w:t>:</w:t>
+      </w:r>
+    </w:p>
+    <w:p>
+      <w:pPr>
+        <w:bidi w:val="0"/>
+        <w:spacing w:before="60" w:after="60"/>
+        <w:jc w:val="right"/>
+        <w:rPr>
+          <w:rtl/>
+        </w:rPr>
+      </w:pPr>
+      <w:r>
+        <w:t xml:space="preserve">- </w:t>
+      </w:r>
+      <w:proofErr w:type="spellStart"/>
+      <w:r>
+        <w:t>WebcamCameraSource</w:t>
+      </w:r>
+      <w:proofErr w:type="spellEnd"/>
+      <w:r>
+        <w:t xml:space="preserve"> </w:t>
+      </w:r>
+      <w:r>
+        <w:rPr>
+          <w:rtl/>
+        </w:rPr>
+        <w:t>הוחלף ב</w:t>
+      </w:r>
+      <w:r>
+        <w:t>-</w:t>
+      </w:r>
+      <w:proofErr w:type="spellStart"/>
+      <w:r>
+        <w:t>BrowserCameraSource</w:t>
+      </w:r>
+      <w:proofErr w:type="spellEnd"/>
+    </w:p>
+    <w:p>
+      <w:pPr>
+        <w:bidi w:val="0"/>
+        <w:spacing w:before="60" w:after="60"/>
+        <w:jc w:val="right"/>
+        <w:rPr>
+          <w:rtl/>
+        </w:rPr>
+      </w:pPr>
+      <w:r>
+        <w:t xml:space="preserve">(Docker </w:t>
+      </w:r>
+      <w:r>
+        <w:rPr>
+          <w:rtl/>
+        </w:rPr>
+        <w:t>על</w:t>
+      </w:r>
+      <w:r>
+        <w:t xml:space="preserve"> Windows </w:t>
+      </w:r>
+      <w:r>
+        <w:rPr>
+          <w:rtl/>
+        </w:rPr>
+        <w:t>לא יכול לגשת למצלמה פיזית</w:t>
+      </w:r>
+      <w:r>
+        <w:t>)</w:t>
+      </w:r>
+    </w:p>
+    <w:p>
+      <w:pPr>
+        <w:bidi w:val="0"/>
+        <w:spacing w:before="60" w:after="60"/>
+        <w:jc w:val="right"/>
+        <w:rPr>
+          <w:rtl/>
+        </w:rPr>
+      </w:pPr>
+      <w:r>
+        <w:t xml:space="preserve">- Angular </w:t>
+      </w:r>
+      <w:r>
+        <w:rPr>
+          <w:rtl/>
+        </w:rPr>
+        <w:t>מצלם דרך</w:t>
+      </w:r>
+      <w:r>
+        <w:t xml:space="preserve"> </w:t>
+      </w:r>
+      <w:proofErr w:type="spellStart"/>
+      <w:proofErr w:type="gramStart"/>
+      <w:r>
+        <w:t>getUserMedia</w:t>
+      </w:r>
+      <w:proofErr w:type="spellEnd"/>
+      <w:r>
+        <w:t>(</w:t>
+      </w:r>
+      <w:proofErr w:type="gramEnd"/>
+      <w:r>
+        <w:t xml:space="preserve">) </w:t>
+      </w:r>
+      <w:r>
+        <w:rPr>
+          <w:rtl/>
+        </w:rPr>
+        <w:t>ושולח</w:t>
+      </w:r>
+      <w:r>
+        <w:t xml:space="preserve"> frames </w:t>
+      </w:r>
+      <w:r>
+        <w:rPr>
+          <w:rtl/>
+        </w:rPr>
+        <w:t>דרך</w:t>
+      </w:r>
+      <w:r>
+        <w:t xml:space="preserve"> </w:t>
+      </w:r>
+      <w:proofErr w:type="spellStart"/>
+      <w:r>
+        <w:t>SignalR</w:t>
+      </w:r>
+      <w:proofErr w:type="spellEnd"/>
+    </w:p>
+    <w:p>
+      <w:pPr>
+        <w:bidi w:val="0"/>
+        <w:spacing w:before="60" w:after="60"/>
+        <w:jc w:val="right"/>
+        <w:rPr>
+          <w:rtl/>
+        </w:rPr>
+      </w:pPr>
+      <w:r>
+        <w:t xml:space="preserve">- Base image </w:t>
+      </w:r>
+      <w:r>
+        <w:rPr>
+          <w:rtl/>
+        </w:rPr>
+        <w:t>שונה ל</w:t>
+      </w:r>
+      <w:r>
+        <w:t>-aspnet:8.0-jammy (Ubuntu 22.04)</w:t>
+      </w:r>
+    </w:p>
+    <w:p>
+      <w:pPr>
+        <w:bidi w:val="0"/>
+        <w:spacing w:before="60" w:after="60"/>
+        <w:jc w:val="right"/>
+      </w:pPr>
+      <w:r>
+        <w:rPr>
+          <w:rtl/>
+        </w:rPr>
+        <w:t>לתאימות עם</w:t>
+      </w:r>
+      <w:r>
+        <w:t xml:space="preserve"> </w:t>
+      </w:r>
+      <w:proofErr w:type="spellStart"/>
+      <w:r>
+        <w:t>OpenCvSharp</w:t>
+      </w:r>
+      <w:proofErr w:type="spellEnd"/>
+      <w:r>
+        <w:t xml:space="preserve"> native libraries</w:t>
+      </w:r>
+    </w:p>
+    <w:p>
+      <w:pPr>
         <w:spacing w:before="120"/>
+        <w:rPr>
+          <w:rFonts w:hint="cs"/>
+        </w:rPr>
       </w:pPr>
     </w:p>
     <w:tbl>
       <w:tblPr>
+        <w:tblpPr w:leftFromText="180" w:rightFromText="180" w:horzAnchor="margin" w:tblpY="1860"/>
         <w:tblW w:w="9360" w:type="dxa"/>
         <w:tblBorders>
           <w:top w:val="single" w:sz="4" w:space="0" w:color="auto"/>
@@ -16696,6 +16907,12 @@
             </w:tcMar>
           </w:tcPr>
           <w:p>
+            <w:pPr>
+              <w:rPr>
+                <w:rFonts w:hint="cs"/>
+                <w:rtl/>
+              </w:rPr>
+            </w:pPr>
             <w:r>
               <w:rPr>
                 <w:color w:val="2C3E50"/>
@@ -17146,10 +17363,23 @@
       </w:tr>
     </w:tbl>
     <w:p>
+      <w:pPr>
+        <w:rPr>
+          <w:rtl/>
+        </w:rPr>
+      </w:pPr>
       <w:r>
         <w:br w:type="page"/>
       </w:r>
     </w:p>
+    <w:p>
+      <w:pPr>
+        <w:rPr>
+          <w:rtl/>
+        </w:rPr>
+      </w:pPr>
+    </w:p>
+    <w:p/>
     <w:p>
       <w:pPr>
         <w:pStyle w:val="1"/>
@@ -17159,7 +17389,6 @@
       </w:pPr>
       <w:proofErr w:type="spellStart"/>
       <w:r>
-        <w:lastRenderedPageBreak/>
         <w:t>שלב</w:t>
       </w:r>
       <w:proofErr w:type="spellEnd"/>
@@ -20009,6 +20238,7 @@
                 <w:sz w:val="20"/>
                 <w:szCs w:val="20"/>
               </w:rPr>
+              <w:lastRenderedPageBreak/>
               <w:t>pgvector</w:t>
             </w:r>
             <w:proofErr w:type="spellEnd"/>
@@ -20191,7 +20421,6 @@
                 <w:sz w:val="20"/>
                 <w:szCs w:val="20"/>
               </w:rPr>
-              <w:lastRenderedPageBreak/>
               <w:t>sounddevice</w:t>
             </w:r>
             <w:proofErr w:type="spellEnd"/>
@@ -48186,6 +48415,7 @@
   <w:style w:type="character" w:default="1" w:styleId="a0">
     <w:name w:val="Default Paragraph Font"/>
     <w:uiPriority w:val="1"/>
+    <w:semiHidden/>
     <w:unhideWhenUsed/>
   </w:style>
   <w:style w:type="table" w:default="1" w:styleId="a1">

</xml_diff>

<commit_message>
step 3.1 & 3.2
</commit_message>
<xml_diff>
--- a/docs/GazeConnect_WorkPlan_v4_FINAL.docx
+++ b/docs/GazeConnect_WorkPlan_v4_FINAL.docx
@@ -16656,9 +16656,6 @@
     <w:p>
       <w:pPr>
         <w:spacing w:before="120"/>
-        <w:rPr>
-          <w:rFonts w:hint="cs"/>
-        </w:rPr>
       </w:pPr>
     </w:p>
     <w:tbl>
@@ -16909,7 +16906,6 @@
           <w:p>
             <w:pPr>
               <w:rPr>
-                <w:rFonts w:hint="cs"/>
                 <w:rtl/>
               </w:rPr>
             </w:pPr>
@@ -24985,6 +24981,9 @@
         </w:tc>
       </w:tr>
       <w:tr>
+        <w:trPr>
+          <w:trHeight w:val="32"/>
+        </w:trPr>
         <w:tc>
           <w:tcPr>
             <w:tcW w:w="9360" w:type="dxa"/>

</xml_diff>